<commit_message>
Upgrade to agentic LLM research architecture
</commit_message>
<xml_diff>
--- a/KeyBoy搜索引擎课程设计增强版说明.docx
+++ b/KeyBoy搜索引擎课程设计增强版说明.docx
@@ -14,7 +14,7 @@
           <w:color w:val="0F766E"/>
           <w:sz w:val="48"/>
         </w:rPr>
-        <w:t>KeyBoy 搜索引擎课程设计增强版说明</w:t>
+        <w:t>KeyBoy 3.0 LLM 多智能体在线研究系统说明</w:t>
       </w:r>
     </w:p>
     <w:p>
@@ -28,7 +28,7 @@
           <w:color w:val="4E5B63"/>
           <w:sz w:val="28"/>
         </w:rPr>
-        <w:t>定向爬取 + 多智能体 + 混合检索 + 可解释评测</w:t>
+        <w:t>Agentic RAG + 在线开放数据源 + LLM 证据合成 + Critic 校验</w:t>
       </w:r>
     </w:p>
     <w:tbl>
@@ -78,7 +78,7 @@
                 <w:b w:val="0"/>
                 <w:sz w:val="18"/>
               </w:rPr>
-              <w:t>KeyBoy 专业领域智能搜索引擎</w:t>
+              <w:t>KeyBoy LLM 多智能体在线研究系统</w:t>
             </w:r>
           </w:p>
         </w:tc>
@@ -121,7 +121,7 @@
                 <w:b w:val="0"/>
                 <w:sz w:val="18"/>
               </w:rPr>
-              <w:t>课程设计增强版 / 可运行演示版</w:t>
+              <w:t>KeyBoy 3.0 / Agentic Deep Research 原型</w:t>
             </w:r>
           </w:p>
         </w:tc>
@@ -164,7 +164,7 @@
                 <w:b w:val="0"/>
                 <w:sz w:val="18"/>
               </w:rPr>
-              <w:t>以现代搜索系统能力提升课程设计完成度与验收表现</w:t>
+              <w:t>从本地搜索升级为可接入真实大模型的在线多智能体系统</w:t>
             </w:r>
           </w:p>
         </w:tc>
@@ -207,7 +207,7 @@
                 <w:b w:val="0"/>
                 <w:sz w:val="18"/>
               </w:rPr>
-              <w:t>Python 标准库、BM25、语义向量、RRF、抽取式摘要、unittest</w:t>
+              <w:t>Agentic RAG、OpenAI-compatible LLM、OpenAlex/arXiv 等在线源、BM25+语义排序、Critic 校验</w:t>
             </w:r>
           </w:p>
         </w:tc>
@@ -250,7 +250,7 @@
                 <w:b w:val="0"/>
                 <w:sz w:val="18"/>
               </w:rPr>
-              <w:t>源代码、前端、语料、评测集、迭代说明、系统设计、验收指南</w:t>
+              <w:t>源代码、前端、在线源适配器、LLM Provider、系统设计、迭代说明、验收指南</w:t>
             </w:r>
           </w:p>
         </w:tc>
@@ -270,7 +270,7 @@
           <w:rFonts w:ascii="Microsoft YaHei" w:hAnsi="Microsoft YaHei" w:eastAsia="Microsoft YaHei"/>
           <w:color w:val="0F766E"/>
         </w:rPr>
-        <w:t>1. 修改迭代总览</w:t>
+        <w:t>1. 架构重构总览</w:t>
       </w:r>
     </w:p>
     <w:p>
@@ -282,7 +282,7 @@
           <w:rFonts w:ascii="Microsoft YaHei" w:hAnsi="Microsoft YaHei" w:eastAsia="Microsoft YaHei"/>
           <w:sz w:val="21"/>
         </w:rPr>
-        <w:t>本增强版在原开发计划书基础上保留课程设计的可控边界，同时重点补强算法先进性、工程可运行性、验收可展示性和质量可证明性。原方案以定向爬取、TF-IDF、本地 JSON 和简单前端为主；增强版升级为多智能体搜索工作台，能展示混合检索、智能摘要、可解释评分和自动评测闭环。</w:t>
+        <w:t>KeyBoy 3.0 不再定位为本地小型搜索引擎，而是升级为 LLM 多智能体在线研究系统。系统采用 Agentic RAG / Deep Research 思路，将复杂问题拆解为规划、在线发现、证据索引、排序、合成和批判校验等步骤；有 API Key 时调用真实大模型，没有 API Key 时进入可解释 fallback。</w:t>
       </w:r>
     </w:p>
     <w:tbl>
@@ -397,7 +397,7 @@
                 <w:b w:val="0"/>
                 <w:sz w:val="18"/>
               </w:rPr>
-              <w:t>检索算法</w:t>
+              <w:t>数据来源</w:t>
             </w:r>
           </w:p>
         </w:tc>
@@ -417,7 +417,7 @@
                 <w:b w:val="0"/>
                 <w:sz w:val="18"/>
               </w:rPr>
-              <w:t>倒排索引 + TF-IDF</w:t>
+              <w:t>本地 JSON 小语料</w:t>
             </w:r>
           </w:p>
         </w:tc>
@@ -437,7 +437,7 @@
                 <w:b w:val="0"/>
                 <w:sz w:val="18"/>
               </w:rPr>
-              <w:t>BM25 + 轻量语义向量 + RRF 融合 + 二阶段重排</w:t>
+              <w:t>OpenAlex、Semantic Scholar、arXiv、Crossref 在线源 + 本地兜底</w:t>
             </w:r>
           </w:p>
         </w:tc>
@@ -499,7 +499,7 @@
                 <w:b w:val="0"/>
                 <w:sz w:val="18"/>
               </w:rPr>
-              <w:t>新增 InsightAgent 与 EvalAgent，形成摘要和评测闭环</w:t>
+              <w:t>ResearchPlanner、OnlineDiscovery、EvidenceRanker、Synthesis、Critic</w:t>
             </w:r>
           </w:p>
         </w:tc>
@@ -521,7 +521,7 @@
                 <w:b w:val="0"/>
                 <w:sz w:val="18"/>
               </w:rPr>
-              <w:t>前端</w:t>
+              <w:t>大模型</w:t>
             </w:r>
           </w:p>
         </w:tc>
@@ -541,7 +541,7 @@
                 <w:b w:val="0"/>
                 <w:sz w:val="18"/>
               </w:rPr>
-              <w:t>搜索框与结果列表</w:t>
+              <w:t>未接入真实模型</w:t>
             </w:r>
           </w:p>
         </w:tc>
@@ -561,7 +561,7 @@
                 <w:b w:val="0"/>
                 <w:sz w:val="18"/>
               </w:rPr>
-              <w:t>结果、摘要、过滤、评分解释、Agent Trace、质量指标同屏展示</w:t>
+              <w:t>OpenAI-compatible Chat Completions，可接入任意兼容模型</w:t>
             </w:r>
           </w:p>
         </w:tc>
@@ -583,7 +583,7 @@
                 <w:b w:val="0"/>
                 <w:sz w:val="18"/>
               </w:rPr>
-              <w:t>质量保证</w:t>
+              <w:t>输出</w:t>
             </w:r>
           </w:p>
         </w:tc>
@@ -603,7 +603,7 @@
                 <w:b w:val="0"/>
                 <w:sz w:val="18"/>
               </w:rPr>
-              <w:t>人工测试为主</w:t>
+              <w:t>搜索结果与摘要</w:t>
             </w:r>
           </w:p>
         </w:tc>
@@ -623,7 +623,7 @@
                 <w:b w:val="0"/>
                 <w:sz w:val="18"/>
               </w:rPr>
-              <w:t>unittest + Recall@5 + nDCG@5 + 平均耗时</w:t>
+              <w:t>研究计划、在线证据、引用答案、风险校验、Agent Trace</w:t>
             </w:r>
           </w:p>
         </w:tc>
@@ -645,7 +645,7 @@
                 <w:b w:val="0"/>
                 <w:sz w:val="18"/>
               </w:rPr>
-              <w:t>部署</w:t>
+              <w:t>架构</w:t>
             </w:r>
           </w:p>
         </w:tc>
@@ -665,7 +665,7 @@
                 <w:b w:val="0"/>
                 <w:sz w:val="18"/>
               </w:rPr>
-              <w:t>依赖若干 Python 库</w:t>
+              <w:t>本地检索原型</w:t>
             </w:r>
           </w:p>
         </w:tc>
@@ -685,7 +685,7 @@
                 <w:b w:val="0"/>
                 <w:sz w:val="18"/>
               </w:rPr>
-              <w:t>核心功能仅需 Python 标准库，演示更稳定</w:t>
+              <w:t>Agentic RAG / Deep Research 工作流</w:t>
             </w:r>
           </w:p>
         </w:tc>
@@ -713,7 +713,7 @@
           <w:rFonts w:ascii="Microsoft YaHei" w:hAnsi="Microsoft YaHei" w:eastAsia="Microsoft YaHei"/>
           <w:sz w:val="20"/>
         </w:rPr>
-        <w:t>混合检索：BM25 处理精确关键词，语义向量覆盖同义表达和长问题。</w:t>
+        <w:t>Agentic RAG：将研究问题拆解为规划、搜索、阅读、合成、批判多个阶段。</w:t>
       </w:r>
     </w:p>
     <w:p>
@@ -726,7 +726,7 @@
           <w:rFonts w:ascii="Microsoft YaHei" w:hAnsi="Microsoft YaHei" w:eastAsia="Microsoft YaHei"/>
           <w:sz w:val="20"/>
         </w:rPr>
-        <w:t>RRF 融合：使用排名位置融合多个检索器，规避分数尺度不一致。</w:t>
+        <w:t>在线开放数据源：接入 OpenAlex、Semantic Scholar、arXiv、Crossref。</w:t>
       </w:r>
     </w:p>
     <w:p>
@@ -739,7 +739,7 @@
           <w:rFonts w:ascii="Microsoft YaHei" w:hAnsi="Microsoft YaHei" w:eastAsia="Microsoft YaHei"/>
           <w:sz w:val="20"/>
         </w:rPr>
-        <w:t>查询画像：根据问题意图、技术词和长度动态调整词法/语义权重。</w:t>
+        <w:t>真实 LLM 接口：通过环境变量接入 OpenAI-compatible 大模型。</w:t>
       </w:r>
     </w:p>
     <w:p>
@@ -752,7 +752,7 @@
           <w:rFonts w:ascii="Microsoft YaHei" w:hAnsi="Microsoft YaHei" w:eastAsia="Microsoft YaHei"/>
           <w:sz w:val="20"/>
         </w:rPr>
-        <w:t>可解释排序：每条结果展示 BM25、语义、RRF、重排分数和命中原因。</w:t>
+        <w:t>证据引用：答案输出引用、来源、URL、时间和证据摘录。</w:t>
       </w:r>
     </w:p>
     <w:p>
@@ -765,7 +765,7 @@
           <w:rFonts w:ascii="Microsoft YaHei" w:hAnsi="Microsoft YaHei" w:eastAsia="Microsoft YaHei"/>
           <w:sz w:val="20"/>
         </w:rPr>
-        <w:t>可评测质量：内置测试查询，自动输出 Recall@5、nDCG@5 和平均耗时。</w:t>
+        <w:t>Critic 校验：检查是否使用真实模型、证据数量和来源多样性。</w:t>
       </w:r>
     </w:p>
     <w:p>
@@ -778,7 +778,7 @@
           <w:rFonts w:ascii="Microsoft YaHei" w:hAnsi="Microsoft YaHei" w:eastAsia="Microsoft YaHei"/>
           <w:sz w:val="20"/>
         </w:rPr>
-        <w:t>稳定演示：内置本地语料，同时保留合规爬虫扩展能力。</w:t>
+        <w:t>稳定演示：没有 API Key 或网络受限时仍可用本地 fallback 运行。</w:t>
       </w:r>
     </w:p>
     <w:p>
@@ -905,7 +905,7 @@
                 <w:b w:val="0"/>
                 <w:sz w:val="18"/>
               </w:rPr>
-              <w:t>CrawlAgent</w:t>
+              <w:t>ResearchPlannerAgent</w:t>
             </w:r>
           </w:p>
         </w:tc>
@@ -925,7 +925,7 @@
                 <w:b w:val="0"/>
                 <w:sz w:val="18"/>
               </w:rPr>
-              <w:t>加载本地语料，可选合规网页抓取</w:t>
+              <w:t>理解问题、拆分子查询、选择在线源</w:t>
             </w:r>
           </w:p>
         </w:tc>
@@ -945,7 +945,69 @@
                 <w:b w:val="0"/>
                 <w:sz w:val="18"/>
               </w:rPr>
-              <w:t>规避现场网络波动，保留扩展能力</w:t>
+              <w:t>体现真实大模型 Agent 规划能力</w:t>
+            </w:r>
+          </w:p>
+        </w:tc>
+      </w:tr>
+      <w:tr>
+        <w:tc>
+          <w:tcPr>
+            <w:tcW w:type="dxa" w:w="3267"/>
+            <w:vAlign w:val="center"/>
+          </w:tcPr>
+          <w:p>
+            <w:pPr>
+              <w:jc w:val="left"/>
+            </w:pPr>
+            <w:r/>
+            <w:r>
+              <w:rPr>
+                <w:rFonts w:ascii="Microsoft YaHei" w:hAnsi="Microsoft YaHei" w:eastAsia="Microsoft YaHei"/>
+                <w:b w:val="0"/>
+                <w:sz w:val="18"/>
+              </w:rPr>
+              <w:t>OnlineDiscoveryAgent</w:t>
+            </w:r>
+          </w:p>
+        </w:tc>
+        <w:tc>
+          <w:tcPr>
+            <w:tcW w:type="dxa" w:w="3267"/>
+            <w:vAlign w:val="center"/>
+          </w:tcPr>
+          <w:p>
+            <w:pPr>
+              <w:jc w:val="left"/>
+            </w:pPr>
+            <w:r/>
+            <w:r>
+              <w:rPr>
+                <w:rFonts w:ascii="Microsoft YaHei" w:hAnsi="Microsoft YaHei" w:eastAsia="Microsoft YaHei"/>
+                <w:b w:val="0"/>
+                <w:sz w:val="18"/>
+              </w:rPr>
+              <w:t>访问 OpenAlex、Semantic Scholar、arXiv、Crossref</w:t>
+            </w:r>
+          </w:p>
+        </w:tc>
+        <w:tc>
+          <w:tcPr>
+            <w:tcW w:type="dxa" w:w="3267"/>
+            <w:vAlign w:val="center"/>
+          </w:tcPr>
+          <w:p>
+            <w:pPr>
+              <w:jc w:val="left"/>
+            </w:pPr>
+            <w:r/>
+            <w:r>
+              <w:rPr>
+                <w:rFonts w:ascii="Microsoft YaHei" w:hAnsi="Microsoft YaHei" w:eastAsia="Microsoft YaHei"/>
+                <w:b w:val="0"/>
+                <w:sz w:val="18"/>
+              </w:rPr>
+              <w:t>不再局限本地小数据库</w:t>
             </w:r>
           </w:p>
         </w:tc>
@@ -1091,7 +1153,7 @@
                 <w:b w:val="0"/>
                 <w:sz w:val="18"/>
               </w:rPr>
-              <w:t>SearchAgent</w:t>
+              <w:t>EvidenceRankerAgent</w:t>
             </w:r>
           </w:p>
         </w:tc>
@@ -1111,7 +1173,7 @@
                 <w:b w:val="0"/>
                 <w:sz w:val="18"/>
               </w:rPr>
-              <w:t>执行检索、融合、重排与解释</w:t>
+              <w:t>排序在线证据，选择高相关资料</w:t>
             </w:r>
           </w:p>
         </w:tc>
@@ -1131,7 +1193,7 @@
                 <w:b w:val="0"/>
                 <w:sz w:val="18"/>
               </w:rPr>
-              <w:t>展示系统智能程度</w:t>
+              <w:t>提升答案证据质量</w:t>
             </w:r>
           </w:p>
         </w:tc>
@@ -1153,7 +1215,7 @@
                 <w:b w:val="0"/>
                 <w:sz w:val="18"/>
               </w:rPr>
-              <w:t>InsightAgent</w:t>
+              <w:t>SynthesisAgent</w:t>
             </w:r>
           </w:p>
         </w:tc>
@@ -1173,7 +1235,7 @@
                 <w:b w:val="0"/>
                 <w:sz w:val="18"/>
               </w:rPr>
-              <w:t>生成查询摘要和洞察</w:t>
+              <w:t>调用 LLM 或 fallback 生成带引用答案</w:t>
             </w:r>
           </w:p>
         </w:tc>
@@ -1193,7 +1255,7 @@
                 <w:b w:val="0"/>
                 <w:sz w:val="18"/>
               </w:rPr>
-              <w:t>提升结果可读性</w:t>
+              <w:t>输出研究报告式答案</w:t>
             </w:r>
           </w:p>
         </w:tc>
@@ -1215,7 +1277,7 @@
                 <w:b w:val="0"/>
                 <w:sz w:val="18"/>
               </w:rPr>
-              <w:t>EvalAgent</w:t>
+              <w:t>CriticAgent</w:t>
             </w:r>
           </w:p>
         </w:tc>
@@ -1235,7 +1297,7 @@
                 <w:b w:val="0"/>
                 <w:sz w:val="18"/>
               </w:rPr>
-              <w:t>计算 Recall@5、nDCG@5、耗时</w:t>
+              <w:t>检查模型状态、证据数量与来源多样性</w:t>
             </w:r>
           </w:p>
         </w:tc>
@@ -1255,7 +1317,7 @@
                 <w:b w:val="0"/>
                 <w:sz w:val="18"/>
               </w:rPr>
-              <w:t>形成可证明质量闭环</w:t>
+              <w:t>提升可信度</w:t>
             </w:r>
           </w:p>
         </w:tc>
@@ -1315,15 +1377,22 @@
     </w:p>
     <w:p>
       <w:pPr>
-        <w:pStyle w:val="ListBullet"/>
-        <w:spacing w:after="60"/>
+        <w:spacing w:after="120" w:line="300" w:lineRule="auto"/>
       </w:pPr>
       <w:r>
         <w:rPr>
           <w:rFonts w:ascii="Microsoft YaHei" w:hAnsi="Microsoft YaHei" w:eastAsia="Microsoft YaHei"/>
-          <w:sz w:val="20"/>
+          <w:b/>
+          <w:sz w:val="21"/>
         </w:rPr>
-        <w:t>查询“混合检索 BM25 RRF”，展示精确技术词、RRF 融合与评分解释。</w:t>
+        <w:t>真实模型配置：</w:t>
+      </w:r>
+      <w:r>
+        <w:rPr>
+          <w:rFonts w:ascii="Microsoft YaHei" w:hAnsi="Microsoft YaHei" w:eastAsia="Microsoft YaHei"/>
+          <w:sz w:val="21"/>
+        </w:rPr>
+        <w:t>设置 KEYBOY_LLM_API_KEY、KEYBOY_LLM_BASE_URL、KEYBOY_LLM_MODEL 后启用远程 LLM。</w:t>
       </w:r>
     </w:p>
     <w:p>
@@ -1336,7 +1405,7 @@
           <w:rFonts w:ascii="Microsoft YaHei" w:hAnsi="Microsoft YaHei" w:eastAsia="Microsoft YaHei"/>
           <w:sz w:val="20"/>
         </w:rPr>
-        <w:t>查询“如何提升课程设计搜索准确率”，展示自然语言查询、语义召回和摘要。</w:t>
+        <w:t>查询“Agentic RAG GraphRAG LightRAG Self-RAG 最新研究怎么整合到课程项目”。</w:t>
       </w:r>
     </w:p>
     <w:p>
@@ -1349,7 +1418,7 @@
           <w:rFonts w:ascii="Microsoft YaHei" w:hAnsi="Microsoft YaHei" w:eastAsia="Microsoft YaHei"/>
           <w:sz w:val="20"/>
         </w:rPr>
-        <w:t>查询“爬虫合规 robots 频率控制”，展示合规设计和工程风险控制。</w:t>
+        <w:t>展示 ResearchPlannerAgent 的子查询、OnlineDiscoveryAgent 的在线资料、SynthesisAgent 的答案。</w:t>
       </w:r>
     </w:p>
     <w:p>
@@ -1362,7 +1431,7 @@
           <w:rFonts w:ascii="Microsoft YaHei" w:hAnsi="Microsoft YaHei" w:eastAsia="Microsoft YaHei"/>
           <w:sz w:val="20"/>
         </w:rPr>
-        <w:t>切换 Hybrid、BM25、Semantic 三种模式，直观看到算法差异。</w:t>
+        <w:t>说明没有 API Key 时系统会明确显示 fallback，不伪装大模型调用。</w:t>
       </w:r>
     </w:p>
     <w:p>
@@ -1375,7 +1444,7 @@
           <w:rFonts w:ascii="Microsoft YaHei" w:hAnsi="Microsoft YaHei" w:eastAsia="Microsoft YaHei"/>
           <w:sz w:val="20"/>
         </w:rPr>
-        <w:t>打开右侧质量指标，展示 Recall@5、nDCG@5 和平均耗时。</w:t>
+        <w:t>展示 CriticAgent 对证据不足、来源单一、未启用模型等风险的提示。</w:t>
       </w:r>
     </w:p>
     <w:p>
@@ -1550,7 +1619,7 @@
                 <w:b w:val="0"/>
                 <w:sz w:val="18"/>
               </w:rPr>
-              <w:t>4/4 通过</w:t>
+              <w:t>5/5 通过</w:t>
             </w:r>
           </w:p>
         </w:tc>
@@ -1570,7 +1639,7 @@
                 <w:b w:val="0"/>
                 <w:sz w:val="18"/>
               </w:rPr>
-              <w:t>覆盖索引、搜索、摘要、评测</w:t>
+              <w:t>覆盖本地搜索与 Agentic Research 离线管线</w:t>
             </w:r>
           </w:p>
         </w:tc>
@@ -1612,7 +1681,7 @@
                 <w:b w:val="0"/>
                 <w:sz w:val="18"/>
               </w:rPr>
-              <w:t>Recall@5</w:t>
+              <w:t>在线源</w:t>
             </w:r>
           </w:p>
         </w:tc>
@@ -1632,7 +1701,7 @@
                 <w:b w:val="0"/>
                 <w:sz w:val="18"/>
               </w:rPr>
-              <w:t>0.90</w:t>
+              <w:t>4 类</w:t>
             </w:r>
           </w:p>
         </w:tc>
@@ -1652,7 +1721,7 @@
                 <w:b w:val="0"/>
                 <w:sz w:val="18"/>
               </w:rPr>
-              <w:t>相关文档召回能力强</w:t>
+              <w:t>OpenAlex、Semantic Scholar、arXiv、Crossref</w:t>
             </w:r>
           </w:p>
         </w:tc>
@@ -1672,7 +1741,7 @@
                 <w:b w:val="0"/>
                 <w:sz w:val="18"/>
               </w:rPr>
-              <w:t>证明结果不漏关键信息</w:t>
+              <w:t>支撑在线大数据获取</w:t>
             </w:r>
           </w:p>
         </w:tc>
@@ -1694,7 +1763,7 @@
                 <w:b w:val="0"/>
                 <w:sz w:val="18"/>
               </w:rPr>
-              <w:t>nDCG@5</w:t>
+              <w:t>LLM 接口</w:t>
             </w:r>
           </w:p>
         </w:tc>
@@ -1714,7 +1783,7 @@
                 <w:b w:val="0"/>
                 <w:sz w:val="18"/>
               </w:rPr>
-              <w:t>0.8493</w:t>
+              <w:t>OpenAI-compatible</w:t>
             </w:r>
           </w:p>
         </w:tc>
@@ -1734,7 +1803,7 @@
                 <w:b w:val="0"/>
                 <w:sz w:val="18"/>
               </w:rPr>
-              <w:t>相关文档排序靠前</w:t>
+              <w:t>通过环境变量配置模型服务</w:t>
             </w:r>
           </w:p>
         </w:tc>
@@ -1754,7 +1823,7 @@
                 <w:b w:val="0"/>
                 <w:sz w:val="18"/>
               </w:rPr>
-              <w:t>证明排序质量</w:t>
+              <w:t>可接入真实大模型</w:t>
             </w:r>
           </w:p>
         </w:tc>
@@ -1776,7 +1845,7 @@
                 <w:b w:val="0"/>
                 <w:sz w:val="18"/>
               </w:rPr>
-              <w:t>平均耗时</w:t>
+              <w:t>Critic 校验</w:t>
             </w:r>
           </w:p>
         </w:tc>
@@ -1796,7 +1865,7 @@
                 <w:b w:val="0"/>
                 <w:sz w:val="18"/>
               </w:rPr>
-              <w:t>毫秒级</w:t>
+              <w:t>已实现</w:t>
             </w:r>
           </w:p>
         </w:tc>
@@ -1816,7 +1885,7 @@
                 <w:b w:val="0"/>
                 <w:sz w:val="18"/>
               </w:rPr>
-              <w:t>本地演示语料快速响应</w:t>
+              <w:t>检查模型状态、证据数量、来源多样性</w:t>
             </w:r>
           </w:p>
         </w:tc>
@@ -1836,7 +1905,7 @@
                 <w:b w:val="0"/>
                 <w:sz w:val="18"/>
               </w:rPr>
-              <w:t>满足小于 3 秒目标</w:t>
+              <w:t>提升可信度</w:t>
             </w:r>
           </w:p>
         </w:tc>
@@ -1863,7 +1932,7 @@
           <w:rFonts w:ascii="Microsoft YaHei" w:hAnsi="Microsoft YaHei" w:eastAsia="Microsoft YaHei"/>
           <w:sz w:val="21"/>
         </w:rPr>
-        <w:t>我们没有停留在最初的 TF-IDF 搜索，而是参考现代搜索系统，把 KeyBoy 做成了混合检索工作台。系统同时支持 BM25、语义向量和 RRF 融合排序，并且每条结果都有可解释分数。多智能体流水线覆盖采集、清洗、索引、搜索、摘要和评测，前端能展示 Agent Trace、查询画像和质量指标。因此项目不仅能运行，还能解释为什么这样设计、如何证明质量、如何继续扩展。</w:t>
+        <w:t>我们没有停留在本地 TF-IDF 搜索，而是把 KeyBoy 重构为 Agentic RAG / Deep Research 系统。现在它具备研究规划、在线开放数据源获取、证据排序、LLM 合成、引用输出和 Critic 风险校验。没有 API Key 时系统会明确进入 fallback，不会伪装调用大模型；有 API Key 时可接入任意 OpenAI-compatible 模型。这个架构已经从课程演示原型走向真实前沿系统的雏形。</w:t>
       </w:r>
     </w:p>
     <w:p>
@@ -1888,7 +1957,7 @@
           <w:rFonts w:ascii="Microsoft YaHei" w:hAnsi="Microsoft YaHei" w:eastAsia="Microsoft YaHei"/>
           <w:sz w:val="20"/>
         </w:rPr>
-        <w:t>Elasticsearch RRF 文档：多个相关性指标可以通过倒数排名融合为单一结果集。</w:t>
+        <w:t>GraphRAG：从局部片段检索扩展到全局图谱 sensemaking。</w:t>
       </w:r>
     </w:p>
     <w:p>
@@ -1901,7 +1970,7 @@
           <w:rFonts w:ascii="Microsoft YaHei" w:hAnsi="Microsoft YaHei" w:eastAsia="Microsoft YaHei"/>
           <w:sz w:val="20"/>
         </w:rPr>
-        <w:t>OpenSearch Hybrid Search：关键词检索与神经/语义检索可结合并进行分数处理。</w:t>
+        <w:t>LightRAG：以轻量图结构提升 RAG 效率和上下文关联。</w:t>
       </w:r>
     </w:p>
     <w:p>
@@ -1914,7 +1983,7 @@
           <w:rFonts w:ascii="Microsoft YaHei" w:hAnsi="Microsoft YaHei" w:eastAsia="Microsoft YaHei"/>
           <w:sz w:val="20"/>
         </w:rPr>
-        <w:t>Faiss 文档：向量相似度检索是现代语义搜索的重要基础。</w:t>
+        <w:t>Self-RAG：生成过程加入检索决策和自我批判。</w:t>
       </w:r>
     </w:p>
     <w:p>
@@ -1927,7 +1996,7 @@
           <w:rFonts w:ascii="Microsoft YaHei" w:hAnsi="Microsoft YaHei" w:eastAsia="Microsoft YaHei"/>
           <w:sz w:val="20"/>
         </w:rPr>
-        <w:t>BEIR 检索评测论文：搜索质量需要用统一基准、Recall、nDCG 等指标验证。</w:t>
+        <w:t>AutoGen / LangGraph：多智能体编排和可观测执行轨迹。</w:t>
       </w:r>
     </w:p>
     <w:sectPr>

</xml_diff>

<commit_message>
Add Bailian Qwen model support
</commit_message>
<xml_diff>
--- a/KeyBoy搜索引擎课程设计增强版说明.docx
+++ b/KeyBoy搜索引擎课程设计增强版说明.docx
@@ -207,7 +207,7 @@
                 <w:b w:val="0"/>
                 <w:sz w:val="18"/>
               </w:rPr>
-              <w:t>Agentic RAG、OpenAI-compatible LLM、OpenAlex/arXiv 等在线源、BM25+语义排序、Critic 校验</w:t>
+              <w:t>Agentic RAG、百炼/Qwen3.6、OpenAlex/arXiv 等在线源、BM25+语义排序、Critic 校验</w:t>
             </w:r>
           </w:p>
         </w:tc>
@@ -1392,7 +1392,7 @@
           <w:rFonts w:ascii="Microsoft YaHei" w:hAnsi="Microsoft YaHei" w:eastAsia="Microsoft YaHei"/>
           <w:sz w:val="21"/>
         </w:rPr>
-        <w:t>设置 KEYBOY_LLM_API_KEY、KEYBOY_LLM_BASE_URL、KEYBOY_LLM_MODEL 后启用远程 LLM。</w:t>
+        <w:t>设置 DASHSCOPE_API_KEY 后默认启用百炼 OpenAI 兼容接口和 qwen3.6-max-preview。</w:t>
       </w:r>
     </w:p>
     <w:p>

</xml_diff>